<commit_message>
v14: improve system template export quality
</commit_message>
<xml_diff>
--- a/templates/sample_lesson_template.docx
+++ b/templates/sample_lesson_template.docx
@@ -332,6 +332,35 @@
           <w:color w:val="1F5EDC"/>
           <w:sz w:val="24"/>
         </w:rPr>
+        <w:t>教学方法的运用</w:t>
+      </w:r>
+    </w:p>
+    <w:p>
+      <w:pPr>
+        <w:spacing w:line="324" w:lineRule="auto" w:after="120"/>
+        <w:ind w:left="115"/>
+      </w:pPr>
+      <w:r>
+        <w:rPr>
+          <w:rFonts w:ascii="Microsoft YaHei" w:hAnsi="Microsoft YaHei" w:eastAsia="Microsoft YaHei"/>
+          <w:b w:val="0"/>
+          <w:color w:val="111827"/>
+          <w:sz w:val="21"/>
+        </w:rPr>
+        <w:t>{{teaching_method}}</w:t>
+      </w:r>
+    </w:p>
+    <w:p>
+      <w:pPr>
+        <w:spacing w:before="200" w:after="60"/>
+      </w:pPr>
+      <w:r>
+        <w:rPr>
+          <w:rFonts w:ascii="Microsoft YaHei" w:hAnsi="Microsoft YaHei" w:eastAsia="Microsoft YaHei"/>
+          <w:b/>
+          <w:color w:val="1F5EDC"/>
+          <w:sz w:val="24"/>
+        </w:rPr>
         <w:t>教学过程</w:t>
       </w:r>
     </w:p>

</xml_diff>